<commit_message>
Refactor DAP table generation to use master indicator bank with language support and sanitize data frames for Quarto rendering
</commit_message>
<xml_diff>
--- a/inst/resources/iphra_tor_template.docx
+++ b/inst/resources/iphra_tor_template.docx
@@ -15,13 +15,6 @@
         </w:rPr>
         <w:t>Test</w:t>
       </w:r>
-    </w:p>
-    <w:p>
-      <w:pPr>
-        <w:rPr>
-          <w:lang w:val="en-US"/>
-        </w:rPr>
-      </w:pPr>
     </w:p>
     <w:p>
       <w:pPr>
@@ -277,35 +270,301 @@
           </w:r>
         </w:p>
         <w:p>
+          <w:pPr>
+            <w:pStyle w:val="TOC1"/>
+            <w:rPr>
+              <w:rFonts w:asciiTheme="minorHAnsi" w:eastAsiaTheme="minorEastAsia" w:hAnsiTheme="minorHAnsi" w:cstheme="minorBidi"/>
+              <w:b w:val="0"/>
+              <w:smallCaps w:val="0"/>
+              <w:color w:val="auto"/>
+              <w:kern w:val="2"/>
+              <w:sz w:val="24"/>
+              <w:szCs w:val="24"/>
+              <w:lang w:val="en-CH" w:eastAsia="en-CH"/>
+              <w14:ligatures w14:val="standardContextual"/>
+            </w:rPr>
+          </w:pPr>
           <w:r>
+            <w:rPr>
+              <w:b w:val="0"/>
+            </w:rPr>
             <w:fldChar w:fldCharType="begin"/>
           </w:r>
           <w:r>
+            <w:rPr>
+              <w:b w:val="0"/>
+            </w:rPr>
             <w:instrText xml:space="preserve"> TOC \o "1-3" \h \z \u </w:instrText>
           </w:r>
           <w:r>
+            <w:rPr>
+              <w:b w:val="0"/>
+            </w:rPr>
             <w:fldChar w:fldCharType="separate"/>
           </w:r>
+          <w:hyperlink w:anchor="_Toc233647445" w:history="1">
+            <w:r>
+              <w:rPr>
+                <w:rStyle w:val="Hyperlink"/>
+              </w:rPr>
+              <w:t>Heading 1</w:t>
+            </w:r>
+            <w:r>
+              <w:rPr>
+                <w:webHidden/>
+              </w:rPr>
+              <w:tab/>
+            </w:r>
+            <w:r>
+              <w:rPr>
+                <w:webHidden/>
+              </w:rPr>
+              <w:fldChar w:fldCharType="begin"/>
+            </w:r>
+            <w:r>
+              <w:rPr>
+                <w:webHidden/>
+              </w:rPr>
+              <w:instrText xml:space="preserve"> PAGEREF _Toc233647445 \h </w:instrText>
+            </w:r>
+            <w:r>
+              <w:rPr>
+                <w:webHidden/>
+              </w:rPr>
+            </w:r>
+            <w:r>
+              <w:rPr>
+                <w:webHidden/>
+              </w:rPr>
+              <w:fldChar w:fldCharType="separate"/>
+            </w:r>
+            <w:r>
+              <w:rPr>
+                <w:webHidden/>
+              </w:rPr>
+              <w:t>2</w:t>
+            </w:r>
+            <w:r>
+              <w:rPr>
+                <w:webHidden/>
+              </w:rPr>
+              <w:fldChar w:fldCharType="end"/>
+            </w:r>
+          </w:hyperlink>
+        </w:p>
+        <w:p>
+          <w:pPr>
+            <w:pStyle w:val="TOC2"/>
+            <w:rPr>
+              <w:rFonts w:asciiTheme="minorHAnsi" w:eastAsiaTheme="minorEastAsia" w:hAnsiTheme="minorHAnsi" w:cstheme="minorBidi"/>
+              <w:kern w:val="2"/>
+              <w:sz w:val="24"/>
+              <w:szCs w:val="24"/>
+              <w:lang w:val="en-CH" w:eastAsia="en-CH"/>
+              <w14:ligatures w14:val="standardContextual"/>
+            </w:rPr>
+          </w:pPr>
+          <w:hyperlink w:anchor="_Toc233647446" w:history="1">
+            <w:r>
+              <w:rPr>
+                <w:rStyle w:val="Hyperlink"/>
+              </w:rPr>
+              <w:t>Heading 2</w:t>
+            </w:r>
+            <w:r>
+              <w:rPr>
+                <w:webHidden/>
+              </w:rPr>
+              <w:tab/>
+            </w:r>
+            <w:r>
+              <w:rPr>
+                <w:webHidden/>
+              </w:rPr>
+              <w:fldChar w:fldCharType="begin"/>
+            </w:r>
+            <w:r>
+              <w:rPr>
+                <w:webHidden/>
+              </w:rPr>
+              <w:instrText xml:space="preserve"> PAGEREF _Toc233647446 \h </w:instrText>
+            </w:r>
+            <w:r>
+              <w:rPr>
+                <w:webHidden/>
+              </w:rPr>
+            </w:r>
+            <w:r>
+              <w:rPr>
+                <w:webHidden/>
+              </w:rPr>
+              <w:fldChar w:fldCharType="separate"/>
+            </w:r>
+            <w:r>
+              <w:rPr>
+                <w:webHidden/>
+              </w:rPr>
+              <w:t>2</w:t>
+            </w:r>
+            <w:r>
+              <w:rPr>
+                <w:webHidden/>
+              </w:rPr>
+              <w:fldChar w:fldCharType="end"/>
+            </w:r>
+          </w:hyperlink>
+        </w:p>
+        <w:p>
+          <w:pPr>
+            <w:pStyle w:val="TOC3"/>
+            <w:rPr>
+              <w:rFonts w:asciiTheme="minorHAnsi" w:eastAsiaTheme="minorEastAsia" w:hAnsiTheme="minorHAnsi" w:cstheme="minorBidi"/>
+              <w:noProof/>
+              <w:color w:val="auto"/>
+              <w:kern w:val="2"/>
+              <w:sz w:val="24"/>
+              <w:szCs w:val="24"/>
+              <w:lang w:val="en-CH" w:eastAsia="en-CH"/>
+              <w14:ligatures w14:val="standardContextual"/>
+            </w:rPr>
+          </w:pPr>
+          <w:hyperlink w:anchor="_Toc233647447" w:history="1">
+            <w:r>
+              <w:rPr>
+                <w:rStyle w:val="Hyperlink"/>
+                <w:noProof/>
+                <w:lang w:val="en-US"/>
+              </w:rPr>
+              <w:t>Heading 3</w:t>
+            </w:r>
+            <w:r>
+              <w:rPr>
+                <w:noProof/>
+                <w:webHidden/>
+              </w:rPr>
+              <w:tab/>
+            </w:r>
+            <w:r>
+              <w:rPr>
+                <w:noProof/>
+                <w:webHidden/>
+              </w:rPr>
+              <w:fldChar w:fldCharType="begin"/>
+            </w:r>
+            <w:r>
+              <w:rPr>
+                <w:noProof/>
+                <w:webHidden/>
+              </w:rPr>
+              <w:instrText xml:space="preserve"> PAGEREF _Toc233647447 \h </w:instrText>
+            </w:r>
+            <w:r>
+              <w:rPr>
+                <w:noProof/>
+                <w:webHidden/>
+              </w:rPr>
+            </w:r>
+            <w:r>
+              <w:rPr>
+                <w:noProof/>
+                <w:webHidden/>
+              </w:rPr>
+              <w:fldChar w:fldCharType="separate"/>
+            </w:r>
+            <w:r>
+              <w:rPr>
+                <w:noProof/>
+                <w:webHidden/>
+              </w:rPr>
+              <w:t>2</w:t>
+            </w:r>
+            <w:r>
+              <w:rPr>
+                <w:noProof/>
+                <w:webHidden/>
+              </w:rPr>
+              <w:fldChar w:fldCharType="end"/>
+            </w:r>
+          </w:hyperlink>
+        </w:p>
+        <w:p>
           <w:r>
             <w:rPr>
+              <w:rFonts w:eastAsia="Times New Roman" w:cs="Arial"/>
               <w:b/>
-              <w:bCs/>
               <w:noProof/>
-              <w:lang w:val="en-US"/>
-            </w:rPr>
-            <w:t>No table of contents entries found.</w:t>
-          </w:r>
-          <w:r>
-            <w:rPr>
-              <w:b/>
-              <w:bCs/>
-              <w:noProof/>
+              <w:color w:val="EE5859"/>
+              <w:kern w:val="28"/>
             </w:rPr>
             <w:fldChar w:fldCharType="end"/>
           </w:r>
         </w:p>
       </w:sdtContent>
     </w:sdt>
+    <w:p>
+      <w:pPr>
+        <w:rPr>
+          <w:lang w:val="en-US"/>
+        </w:rPr>
+      </w:pPr>
+    </w:p>
+    <w:p>
+      <w:pPr>
+        <w:rPr>
+          <w:lang w:val="en-US"/>
+        </w:rPr>
+      </w:pPr>
+    </w:p>
+    <w:p>
+      <w:pPr>
+        <w:rPr>
+          <w:lang w:val="en-US"/>
+        </w:rPr>
+      </w:pPr>
+    </w:p>
+    <w:p>
+      <w:pPr>
+        <w:rPr>
+          <w:lang w:val="en-US"/>
+        </w:rPr>
+      </w:pPr>
+    </w:p>
+    <w:p>
+      <w:pPr>
+        <w:pStyle w:val="Heading1"/>
+      </w:pPr>
+      <w:bookmarkStart w:id="0" w:name="_Toc233647445"/>
+      <w:r>
+        <w:t>Heading 1</w:t>
+      </w:r>
+      <w:bookmarkEnd w:id="0"/>
+    </w:p>
+    <w:p>
+      <w:pPr>
+        <w:pStyle w:val="Heading2"/>
+      </w:pPr>
+      <w:bookmarkStart w:id="1" w:name="_Toc233647446"/>
+      <w:r>
+        <w:t>Heading 2</w:t>
+      </w:r>
+      <w:bookmarkEnd w:id="1"/>
+    </w:p>
+    <w:p>
+      <w:pPr>
+        <w:pStyle w:val="Heading3"/>
+        <w:rPr>
+          <w:lang w:val="en-US"/>
+        </w:rPr>
+      </w:pPr>
+      <w:bookmarkStart w:id="2" w:name="_Toc233647447"/>
+      <w:r>
+        <w:rPr>
+          <w:lang w:val="en-US"/>
+        </w:rPr>
+        <w:t>Heading 3</w:t>
+      </w:r>
+      <w:bookmarkEnd w:id="2"/>
+    </w:p>
     <w:p>
       <w:pPr>
         <w:rPr>
@@ -6828,7 +7087,7 @@
     <w:autoRedefine/>
     <w:uiPriority w:val="39"/>
     <w:unhideWhenUsed/>
-    <w:rsid w:val="0070367E"/>
+    <w:rsid w:val="00F26BB2"/>
     <w:pPr>
       <w:tabs>
         <w:tab w:val="right" w:leader="dot" w:pos="9737"/>
@@ -6874,13 +7133,13 @@
     <w:autoRedefine/>
     <w:uiPriority w:val="39"/>
     <w:unhideWhenUsed/>
-    <w:rsid w:val="001556F3"/>
+    <w:rsid w:val="00F26BB2"/>
     <w:pPr>
       <w:tabs>
-        <w:tab w:val="right" w:leader="dot" w:pos="9072"/>
+        <w:tab w:val="right" w:leader="dot" w:pos="9734"/>
       </w:tabs>
-      <w:spacing w:before="0" w:after="0"/>
-      <w:ind w:left="360"/>
+      <w:spacing w:before="0" w:after="0" w:line="240" w:lineRule="auto"/>
+      <w:ind w:left="864"/>
       <w:jc w:val="left"/>
     </w:pPr>
     <w:rPr>
@@ -8480,65 +8739,6 @@
 </file>
 
 <file path=customXml/item1.xml><?xml version="1.0" encoding="utf-8"?>
-<p:properties xmlns:p="http://schemas.microsoft.com/office/2006/metadata/properties" xmlns:xsi="http://www.w3.org/2001/XMLSchema-instance" xmlns:pc="http://schemas.microsoft.com/office/infopath/2007/PartnerControls">
-  <documentManagement>
-    <TaxCatchAll xmlns="d0fa6634-326e-4532-91a2-52bea7ac9212" xsi:nil="true"/>
-    <lcf76f155ced4ddcb4097134ff3c332f xmlns="f4877444-78fa-4cfa-bafc-d6c64fafc061">
-      <Terms xmlns="http://schemas.microsoft.com/office/infopath/2007/PartnerControls"/>
-    </lcf76f155ced4ddcb4097134ff3c332f>
-    <SharedWithUsers xmlns="d0fa6634-326e-4532-91a2-52bea7ac9212">
-      <UserInfo>
-        <DisplayName>Abraham AZAR</DisplayName>
-        <AccountId>90</AccountId>
-        <AccountType/>
-      </UserInfo>
-      <UserInfo>
-        <DisplayName>Katie RICKARD</DisplayName>
-        <AccountId>17</AccountId>
-        <AccountType/>
-      </UserInfo>
-      <UserInfo>
-        <DisplayName>Alexis REYNAUD</DisplayName>
-        <AccountId>43</AccountId>
-        <AccountType/>
-      </UserInfo>
-      <UserInfo>
-        <DisplayName>Saeed RAHMAN</DisplayName>
-        <AccountId>13</AccountId>
-        <AccountType/>
-      </UserInfo>
-      <UserInfo>
-        <DisplayName>Nayana DAS</DisplayName>
-        <AccountId>44</AccountId>
-        <AccountType/>
-      </UserInfo>
-      <UserInfo>
-        <DisplayName>Anna PASCALE</DisplayName>
-        <AccountId>172</AccountId>
-        <AccountType/>
-      </UserInfo>
-      <UserInfo>
-        <DisplayName>Christina KAY</DisplayName>
-        <AccountId>144</AccountId>
-        <AccountType/>
-      </UserInfo>
-      <UserInfo>
-        <DisplayName>Noortje GERRITSMA</DisplayName>
-        <AccountId>15</AccountId>
-        <AccountType/>
-      </UserInfo>
-    </SharedWithUsers>
-    <_ip_UnifiedCompliancePolicyUIAction xmlns="http://schemas.microsoft.com/sharepoint/v3" xsi:nil="true"/>
-    <_ip_UnifiedCompliancePolicyProperties xmlns="http://schemas.microsoft.com/sharepoint/v3" xsi:nil="true"/>
-  </documentManagement>
-</p:properties>
-</file>
-
-<file path=customXml/item2.xml><?xml version="1.0" encoding="utf-8"?>
-<b:Sources xmlns:b="http://schemas.openxmlformats.org/officeDocument/2006/bibliography" xmlns="http://schemas.openxmlformats.org/officeDocument/2006/bibliography" SelectedStyle="\APA.XSL" StyleName="APA"/>
-</file>
-
-<file path=customXml/item3.xml><?xml version="1.0" encoding="utf-8"?>
 <ct:contentTypeSchema xmlns:ct="http://schemas.microsoft.com/office/2006/metadata/contentType" xmlns:ma="http://schemas.microsoft.com/office/2006/metadata/properties/metaAttributes" ct:_="" ma:_="" ma:contentTypeName="Document" ma:contentTypeID="0x010100DE51FB2AFBB2DD429D3D11FE759FFC43" ma:contentTypeVersion="18" ma:contentTypeDescription="Crée un document." ma:contentTypeScope="" ma:versionID="df5b28ce25a628da7e4351ecd50f592e">
   <xsd:schema xmlns:xsd="http://www.w3.org/2001/XMLSchema" xmlns:xs="http://www.w3.org/2001/XMLSchema" xmlns:p="http://schemas.microsoft.com/office/2006/metadata/properties" xmlns:ns1="http://schemas.microsoft.com/sharepoint/v3" xmlns:ns2="f4877444-78fa-4cfa-bafc-d6c64fafc061" xmlns:ns3="d0fa6634-326e-4532-91a2-52bea7ac9212" targetNamespace="http://schemas.microsoft.com/office/2006/metadata/properties" ma:root="true" ma:fieldsID="829ade136f372bbc1f9334b9c4b8c0cd" ns1:_="" ns2:_="" ns3:_="">
     <xsd:import namespace="http://schemas.microsoft.com/sharepoint/v3"/>
@@ -8796,7 +8996,7 @@
 </ct:contentTypeSchema>
 </file>
 
-<file path=customXml/item4.xml><?xml version="1.0" encoding="utf-8"?>
+<file path=customXml/item2.xml><?xml version="1.0" encoding="utf-8"?>
 <?mso-contentType ?>
 <FormTemplates xmlns="http://schemas.microsoft.com/sharepoint/v3/contenttype/forms">
   <Display>DocumentLibraryForm</Display>
@@ -8805,27 +9005,66 @@
 </FormTemplates>
 </file>
 
-<file path=customXml/itemProps1.xml><?xml version="1.0" encoding="utf-8"?>
-<ds:datastoreItem xmlns:ds="http://schemas.openxmlformats.org/officeDocument/2006/customXml" ds:itemID="{1AFA309A-7571-4718-852F-D50EAD4E9DD2}">
-  <ds:schemaRefs>
-    <ds:schemaRef ds:uri="http://schemas.microsoft.com/office/2006/metadata/properties"/>
-    <ds:schemaRef ds:uri="http://schemas.microsoft.com/office/infopath/2007/PartnerControls"/>
-    <ds:schemaRef ds:uri="d0fa6634-326e-4532-91a2-52bea7ac9212"/>
-    <ds:schemaRef ds:uri="f4877444-78fa-4cfa-bafc-d6c64fafc061"/>
-    <ds:schemaRef ds:uri="http://schemas.microsoft.com/sharepoint/v3"/>
-  </ds:schemaRefs>
-</ds:datastoreItem>
+<file path=customXml/item3.xml><?xml version="1.0" encoding="utf-8"?>
+<p:properties xmlns:p="http://schemas.microsoft.com/office/2006/metadata/properties" xmlns:xsi="http://www.w3.org/2001/XMLSchema-instance" xmlns:pc="http://schemas.microsoft.com/office/infopath/2007/PartnerControls">
+  <documentManagement>
+    <TaxCatchAll xmlns="d0fa6634-326e-4532-91a2-52bea7ac9212" xsi:nil="true"/>
+    <lcf76f155ced4ddcb4097134ff3c332f xmlns="f4877444-78fa-4cfa-bafc-d6c64fafc061">
+      <Terms xmlns="http://schemas.microsoft.com/office/infopath/2007/PartnerControls"/>
+    </lcf76f155ced4ddcb4097134ff3c332f>
+    <SharedWithUsers xmlns="d0fa6634-326e-4532-91a2-52bea7ac9212">
+      <UserInfo>
+        <DisplayName>Abraham AZAR</DisplayName>
+        <AccountId>90</AccountId>
+        <AccountType/>
+      </UserInfo>
+      <UserInfo>
+        <DisplayName>Katie RICKARD</DisplayName>
+        <AccountId>17</AccountId>
+        <AccountType/>
+      </UserInfo>
+      <UserInfo>
+        <DisplayName>Alexis REYNAUD</DisplayName>
+        <AccountId>43</AccountId>
+        <AccountType/>
+      </UserInfo>
+      <UserInfo>
+        <DisplayName>Saeed RAHMAN</DisplayName>
+        <AccountId>13</AccountId>
+        <AccountType/>
+      </UserInfo>
+      <UserInfo>
+        <DisplayName>Nayana DAS</DisplayName>
+        <AccountId>44</AccountId>
+        <AccountType/>
+      </UserInfo>
+      <UserInfo>
+        <DisplayName>Anna PASCALE</DisplayName>
+        <AccountId>172</AccountId>
+        <AccountType/>
+      </UserInfo>
+      <UserInfo>
+        <DisplayName>Christina KAY</DisplayName>
+        <AccountId>144</AccountId>
+        <AccountType/>
+      </UserInfo>
+      <UserInfo>
+        <DisplayName>Noortje GERRITSMA</DisplayName>
+        <AccountId>15</AccountId>
+        <AccountType/>
+      </UserInfo>
+    </SharedWithUsers>
+    <_ip_UnifiedCompliancePolicyUIAction xmlns="http://schemas.microsoft.com/sharepoint/v3" xsi:nil="true"/>
+    <_ip_UnifiedCompliancePolicyProperties xmlns="http://schemas.microsoft.com/sharepoint/v3" xsi:nil="true"/>
+  </documentManagement>
+</p:properties>
 </file>
 
-<file path=customXml/itemProps2.xml><?xml version="1.0" encoding="utf-8"?>
-<ds:datastoreItem xmlns:ds="http://schemas.openxmlformats.org/officeDocument/2006/customXml" ds:itemID="{70B9C780-39DA-49AB-999D-1412EABDA6BE}">
-  <ds:schemaRefs>
-    <ds:schemaRef ds:uri="http://schemas.openxmlformats.org/officeDocument/2006/bibliography"/>
-  </ds:schemaRefs>
-</ds:datastoreItem>
+<file path=customXml/item4.xml><?xml version="1.0" encoding="utf-8"?>
+<b:Sources xmlns:b="http://schemas.openxmlformats.org/officeDocument/2006/bibliography" xmlns="http://schemas.openxmlformats.org/officeDocument/2006/bibliography" SelectedStyle="\APA.XSL" StyleName="APA"/>
 </file>
 
-<file path=customXml/itemProps3.xml><?xml version="1.0" encoding="utf-8"?>
+<file path=customXml/itemProps1.xml><?xml version="1.0" encoding="utf-8"?>
 <ds:datastoreItem xmlns:ds="http://schemas.openxmlformats.org/officeDocument/2006/customXml" ds:itemID="{71A4EE20-6FC7-47E2-985E-276E125E961A}">
   <ds:schemaRefs>
     <ds:schemaRef ds:uri="http://schemas.microsoft.com/office/2006/metadata/contentType"/>
@@ -8845,10 +9084,30 @@
 </ds:datastoreItem>
 </file>
 
-<file path=customXml/itemProps4.xml><?xml version="1.0" encoding="utf-8"?>
+<file path=customXml/itemProps2.xml><?xml version="1.0" encoding="utf-8"?>
 <ds:datastoreItem xmlns:ds="http://schemas.openxmlformats.org/officeDocument/2006/customXml" ds:itemID="{1B0974CC-A711-41BA-939B-1E1B9CB04C35}">
   <ds:schemaRefs>
     <ds:schemaRef ds:uri="http://schemas.microsoft.com/sharepoint/v3/contenttype/forms"/>
   </ds:schemaRefs>
 </ds:datastoreItem>
+</file>
+
+<file path=customXml/itemProps3.xml><?xml version="1.0" encoding="utf-8"?>
+<ds:datastoreItem xmlns:ds="http://schemas.openxmlformats.org/officeDocument/2006/customXml" ds:itemID="{1AFA309A-7571-4718-852F-D50EAD4E9DD2}">
+  <ds:schemaRefs>
+    <ds:schemaRef ds:uri="http://schemas.microsoft.com/office/2006/metadata/properties"/>
+    <ds:schemaRef ds:uri="http://schemas.microsoft.com/office/infopath/2007/PartnerControls"/>
+    <ds:schemaRef ds:uri="d0fa6634-326e-4532-91a2-52bea7ac9212"/>
+    <ds:schemaRef ds:uri="f4877444-78fa-4cfa-bafc-d6c64fafc061"/>
+    <ds:schemaRef ds:uri="http://schemas.microsoft.com/sharepoint/v3"/>
+  </ds:schemaRefs>
+</ds:datastoreItem>
+</file>
+
+<file path=customXml/itemProps4.xml><?xml version="1.0" encoding="utf-8"?>
+<ds:datastoreItem xmlns:ds="http://schemas.openxmlformats.org/officeDocument/2006/customXml" ds:itemID="{70B9C780-39DA-49AB-999D-1412EABDA6BE}">
+  <ds:schemaRefs>
+    <ds:schemaRef ds:uri="http://schemas.openxmlformats.org/officeDocument/2006/bibliography"/>
+  </ds:schemaRefs>
+</ds:datastoreItem>
 </file>
</xml_diff>

<commit_message>
Enhance protocol strata methods, add indicator params, and improve ToR template
- Rewrite `..strata_names_for_method()` to filter by site- and household-level sampling methods and return matching strata names instead of a boolean
- Add site-only and household-only strata name active bindings to `SurveyProtocol`
- Add food security and WASH indicator bindings (FCS, rCSI, HHS, LCSI, HWISE, LPPD) to `IPHRAProtocol`
- Pass `r_version` as a Quarto param from `Document`
- Update Quarto ToR template: add reviewer notes, restructure site/household selection and analysis plan sections, use glue for strata params, remove FEWSNET FC indicator, and reposition ANF framework figure
- Add captionify.lua filter and increase ANF SVG font sizes
- Update manual workflow test and regenerated ToR fixtures
</commit_message>
<xml_diff>
--- a/inst/resources/iphra_tor_template.docx
+++ b/inst/resources/iphra_tor_template.docx
@@ -581,17 +581,14 @@
     </w:p>
     <w:p>
       <w:pPr>
+        <w:pStyle w:val="Instructions"/>
+      </w:pPr>
+      <w:r>
         <w:rPr>
-          <w:lang w:val="en-US"/>
+          <w:highlight w:val="yellow"/>
         </w:rPr>
-      </w:pPr>
-    </w:p>
-    <w:p>
-      <w:pPr>
-        <w:rPr>
-          <w:lang w:val="en-US"/>
-        </w:rPr>
-      </w:pPr>
+        <w:t>Instructions</w:t>
+      </w:r>
     </w:p>
     <w:sectPr>
       <w:headerReference w:type="even" r:id="rId11"/>
@@ -8475,6 +8472,39 @@
       <w:szCs w:val="21"/>
     </w:rPr>
   </w:style>
+  <w:style w:type="paragraph" w:customStyle="1" w:styleId="Instructions">
+    <w:name w:val="Instructions"/>
+    <w:basedOn w:val="Normal"/>
+    <w:link w:val="InstructionsChar"/>
+    <w:qFormat/>
+    <w:rsid w:val="00C37C0C"/>
+    <w:pPr>
+      <w:shd w:val="clear" w:color="auto" w:fill="FFFF00"/>
+    </w:pPr>
+    <w:rPr>
+      <w:rFonts w:ascii="Arial Black" w:hAnsi="Arial Black"/>
+      <w:b/>
+      <w:bCs/>
+      <w:sz w:val="24"/>
+      <w:szCs w:val="24"/>
+      <w:lang w:val="en-US"/>
+    </w:rPr>
+  </w:style>
+  <w:style w:type="character" w:customStyle="1" w:styleId="InstructionsChar">
+    <w:name w:val="Instructions Char"/>
+    <w:basedOn w:val="DefaultParagraphFont"/>
+    <w:link w:val="Instructions"/>
+    <w:rsid w:val="00C37C0C"/>
+    <w:rPr>
+      <w:rFonts w:ascii="Arial Black" w:hAnsi="Arial Black"/>
+      <w:b/>
+      <w:bCs/>
+      <w:sz w:val="24"/>
+      <w:szCs w:val="24"/>
+      <w:shd w:val="clear" w:color="auto" w:fill="FFFF00"/>
+      <w:lang w:eastAsia="fr-FR"/>
+    </w:rPr>
+  </w:style>
 </w:styles>
 </file>
 
@@ -8739,6 +8769,74 @@
 </file>
 
 <file path=customXml/item1.xml><?xml version="1.0" encoding="utf-8"?>
+<?mso-contentType ?>
+<FormTemplates xmlns="http://schemas.microsoft.com/sharepoint/v3/contenttype/forms">
+  <Display>DocumentLibraryForm</Display>
+  <Edit>DocumentLibraryForm</Edit>
+  <New>DocumentLibraryForm</New>
+</FormTemplates>
+</file>
+
+<file path=customXml/item2.xml><?xml version="1.0" encoding="utf-8"?>
+<p:properties xmlns:p="http://schemas.microsoft.com/office/2006/metadata/properties" xmlns:xsi="http://www.w3.org/2001/XMLSchema-instance" xmlns:pc="http://schemas.microsoft.com/office/infopath/2007/PartnerControls">
+  <documentManagement>
+    <TaxCatchAll xmlns="d0fa6634-326e-4532-91a2-52bea7ac9212" xsi:nil="true"/>
+    <lcf76f155ced4ddcb4097134ff3c332f xmlns="f4877444-78fa-4cfa-bafc-d6c64fafc061">
+      <Terms xmlns="http://schemas.microsoft.com/office/infopath/2007/PartnerControls"/>
+    </lcf76f155ced4ddcb4097134ff3c332f>
+    <SharedWithUsers xmlns="d0fa6634-326e-4532-91a2-52bea7ac9212">
+      <UserInfo>
+        <DisplayName>Abraham AZAR</DisplayName>
+        <AccountId>90</AccountId>
+        <AccountType/>
+      </UserInfo>
+      <UserInfo>
+        <DisplayName>Katie RICKARD</DisplayName>
+        <AccountId>17</AccountId>
+        <AccountType/>
+      </UserInfo>
+      <UserInfo>
+        <DisplayName>Alexis REYNAUD</DisplayName>
+        <AccountId>43</AccountId>
+        <AccountType/>
+      </UserInfo>
+      <UserInfo>
+        <DisplayName>Saeed RAHMAN</DisplayName>
+        <AccountId>13</AccountId>
+        <AccountType/>
+      </UserInfo>
+      <UserInfo>
+        <DisplayName>Nayana DAS</DisplayName>
+        <AccountId>44</AccountId>
+        <AccountType/>
+      </UserInfo>
+      <UserInfo>
+        <DisplayName>Anna PASCALE</DisplayName>
+        <AccountId>172</AccountId>
+        <AccountType/>
+      </UserInfo>
+      <UserInfo>
+        <DisplayName>Christina KAY</DisplayName>
+        <AccountId>144</AccountId>
+        <AccountType/>
+      </UserInfo>
+      <UserInfo>
+        <DisplayName>Noortje GERRITSMA</DisplayName>
+        <AccountId>15</AccountId>
+        <AccountType/>
+      </UserInfo>
+    </SharedWithUsers>
+    <_ip_UnifiedCompliancePolicyUIAction xmlns="http://schemas.microsoft.com/sharepoint/v3" xsi:nil="true"/>
+    <_ip_UnifiedCompliancePolicyProperties xmlns="http://schemas.microsoft.com/sharepoint/v3" xsi:nil="true"/>
+  </documentManagement>
+</p:properties>
+</file>
+
+<file path=customXml/item3.xml><?xml version="1.0" encoding="utf-8"?>
+<b:Sources xmlns:b="http://schemas.openxmlformats.org/officeDocument/2006/bibliography" xmlns="http://schemas.openxmlformats.org/officeDocument/2006/bibliography" SelectedStyle="\APA.XSL" StyleName="APA"/>
+</file>
+
+<file path=customXml/item4.xml><?xml version="1.0" encoding="utf-8"?>
 <ct:contentTypeSchema xmlns:ct="http://schemas.microsoft.com/office/2006/metadata/contentType" xmlns:ma="http://schemas.microsoft.com/office/2006/metadata/properties/metaAttributes" ct:_="" ma:_="" ma:contentTypeName="Document" ma:contentTypeID="0x010100DE51FB2AFBB2DD429D3D11FE759FFC43" ma:contentTypeVersion="18" ma:contentTypeDescription="Crée un document." ma:contentTypeScope="" ma:versionID="df5b28ce25a628da7e4351ecd50f592e">
   <xsd:schema xmlns:xsd="http://www.w3.org/2001/XMLSchema" xmlns:xs="http://www.w3.org/2001/XMLSchema" xmlns:p="http://schemas.microsoft.com/office/2006/metadata/properties" xmlns:ns1="http://schemas.microsoft.com/sharepoint/v3" xmlns:ns2="f4877444-78fa-4cfa-bafc-d6c64fafc061" xmlns:ns3="d0fa6634-326e-4532-91a2-52bea7ac9212" targetNamespace="http://schemas.microsoft.com/office/2006/metadata/properties" ma:root="true" ma:fieldsID="829ade136f372bbc1f9334b9c4b8c0cd" ns1:_="" ns2:_="" ns3:_="">
     <xsd:import namespace="http://schemas.microsoft.com/sharepoint/v3"/>
@@ -8996,75 +9094,35 @@
 </ct:contentTypeSchema>
 </file>
 
-<file path=customXml/item2.xml><?xml version="1.0" encoding="utf-8"?>
-<?mso-contentType ?>
-<FormTemplates xmlns="http://schemas.microsoft.com/sharepoint/v3/contenttype/forms">
-  <Display>DocumentLibraryForm</Display>
-  <Edit>DocumentLibraryForm</Edit>
-  <New>DocumentLibraryForm</New>
-</FormTemplates>
+<file path=customXml/itemProps1.xml><?xml version="1.0" encoding="utf-8"?>
+<ds:datastoreItem xmlns:ds="http://schemas.openxmlformats.org/officeDocument/2006/customXml" ds:itemID="{1B0974CC-A711-41BA-939B-1E1B9CB04C35}">
+  <ds:schemaRefs>
+    <ds:schemaRef ds:uri="http://schemas.microsoft.com/sharepoint/v3/contenttype/forms"/>
+  </ds:schemaRefs>
+</ds:datastoreItem>
 </file>
 
-<file path=customXml/item3.xml><?xml version="1.0" encoding="utf-8"?>
-<p:properties xmlns:p="http://schemas.microsoft.com/office/2006/metadata/properties" xmlns:xsi="http://www.w3.org/2001/XMLSchema-instance" xmlns:pc="http://schemas.microsoft.com/office/infopath/2007/PartnerControls">
-  <documentManagement>
-    <TaxCatchAll xmlns="d0fa6634-326e-4532-91a2-52bea7ac9212" xsi:nil="true"/>
-    <lcf76f155ced4ddcb4097134ff3c332f xmlns="f4877444-78fa-4cfa-bafc-d6c64fafc061">
-      <Terms xmlns="http://schemas.microsoft.com/office/infopath/2007/PartnerControls"/>
-    </lcf76f155ced4ddcb4097134ff3c332f>
-    <SharedWithUsers xmlns="d0fa6634-326e-4532-91a2-52bea7ac9212">
-      <UserInfo>
-        <DisplayName>Abraham AZAR</DisplayName>
-        <AccountId>90</AccountId>
-        <AccountType/>
-      </UserInfo>
-      <UserInfo>
-        <DisplayName>Katie RICKARD</DisplayName>
-        <AccountId>17</AccountId>
-        <AccountType/>
-      </UserInfo>
-      <UserInfo>
-        <DisplayName>Alexis REYNAUD</DisplayName>
-        <AccountId>43</AccountId>
-        <AccountType/>
-      </UserInfo>
-      <UserInfo>
-        <DisplayName>Saeed RAHMAN</DisplayName>
-        <AccountId>13</AccountId>
-        <AccountType/>
-      </UserInfo>
-      <UserInfo>
-        <DisplayName>Nayana DAS</DisplayName>
-        <AccountId>44</AccountId>
-        <AccountType/>
-      </UserInfo>
-      <UserInfo>
-        <DisplayName>Anna PASCALE</DisplayName>
-        <AccountId>172</AccountId>
-        <AccountType/>
-      </UserInfo>
-      <UserInfo>
-        <DisplayName>Christina KAY</DisplayName>
-        <AccountId>144</AccountId>
-        <AccountType/>
-      </UserInfo>
-      <UserInfo>
-        <DisplayName>Noortje GERRITSMA</DisplayName>
-        <AccountId>15</AccountId>
-        <AccountType/>
-      </UserInfo>
-    </SharedWithUsers>
-    <_ip_UnifiedCompliancePolicyUIAction xmlns="http://schemas.microsoft.com/sharepoint/v3" xsi:nil="true"/>
-    <_ip_UnifiedCompliancePolicyProperties xmlns="http://schemas.microsoft.com/sharepoint/v3" xsi:nil="true"/>
-  </documentManagement>
-</p:properties>
+<file path=customXml/itemProps2.xml><?xml version="1.0" encoding="utf-8"?>
+<ds:datastoreItem xmlns:ds="http://schemas.openxmlformats.org/officeDocument/2006/customXml" ds:itemID="{1AFA309A-7571-4718-852F-D50EAD4E9DD2}">
+  <ds:schemaRefs>
+    <ds:schemaRef ds:uri="http://schemas.microsoft.com/office/2006/metadata/properties"/>
+    <ds:schemaRef ds:uri="http://schemas.microsoft.com/office/infopath/2007/PartnerControls"/>
+    <ds:schemaRef ds:uri="d0fa6634-326e-4532-91a2-52bea7ac9212"/>
+    <ds:schemaRef ds:uri="f4877444-78fa-4cfa-bafc-d6c64fafc061"/>
+    <ds:schemaRef ds:uri="http://schemas.microsoft.com/sharepoint/v3"/>
+  </ds:schemaRefs>
+</ds:datastoreItem>
 </file>
 
-<file path=customXml/item4.xml><?xml version="1.0" encoding="utf-8"?>
-<b:Sources xmlns:b="http://schemas.openxmlformats.org/officeDocument/2006/bibliography" xmlns="http://schemas.openxmlformats.org/officeDocument/2006/bibliography" SelectedStyle="\APA.XSL" StyleName="APA"/>
+<file path=customXml/itemProps3.xml><?xml version="1.0" encoding="utf-8"?>
+<ds:datastoreItem xmlns:ds="http://schemas.openxmlformats.org/officeDocument/2006/customXml" ds:itemID="{70B9C780-39DA-49AB-999D-1412EABDA6BE}">
+  <ds:schemaRefs>
+    <ds:schemaRef ds:uri="http://schemas.openxmlformats.org/officeDocument/2006/bibliography"/>
+  </ds:schemaRefs>
+</ds:datastoreItem>
 </file>
 
-<file path=customXml/itemProps1.xml><?xml version="1.0" encoding="utf-8"?>
+<file path=customXml/itemProps4.xml><?xml version="1.0" encoding="utf-8"?>
 <ds:datastoreItem xmlns:ds="http://schemas.openxmlformats.org/officeDocument/2006/customXml" ds:itemID="{71A4EE20-6FC7-47E2-985E-276E125E961A}">
   <ds:schemaRefs>
     <ds:schemaRef ds:uri="http://schemas.microsoft.com/office/2006/metadata/contentType"/>
@@ -9082,32 +9140,4 @@
     <ds:schemaRef ds:uri="http://schemas.microsoft.com/internal/obd"/>
   </ds:schemaRefs>
 </ds:datastoreItem>
-</file>
-
-<file path=customXml/itemProps2.xml><?xml version="1.0" encoding="utf-8"?>
-<ds:datastoreItem xmlns:ds="http://schemas.openxmlformats.org/officeDocument/2006/customXml" ds:itemID="{1B0974CC-A711-41BA-939B-1E1B9CB04C35}">
-  <ds:schemaRefs>
-    <ds:schemaRef ds:uri="http://schemas.microsoft.com/sharepoint/v3/contenttype/forms"/>
-  </ds:schemaRefs>
-</ds:datastoreItem>
-</file>
-
-<file path=customXml/itemProps3.xml><?xml version="1.0" encoding="utf-8"?>
-<ds:datastoreItem xmlns:ds="http://schemas.openxmlformats.org/officeDocument/2006/customXml" ds:itemID="{1AFA309A-7571-4718-852F-D50EAD4E9DD2}">
-  <ds:schemaRefs>
-    <ds:schemaRef ds:uri="http://schemas.microsoft.com/office/2006/metadata/properties"/>
-    <ds:schemaRef ds:uri="http://schemas.microsoft.com/office/infopath/2007/PartnerControls"/>
-    <ds:schemaRef ds:uri="d0fa6634-326e-4532-91a2-52bea7ac9212"/>
-    <ds:schemaRef ds:uri="f4877444-78fa-4cfa-bafc-d6c64fafc061"/>
-    <ds:schemaRef ds:uri="http://schemas.microsoft.com/sharepoint/v3"/>
-  </ds:schemaRefs>
-</ds:datastoreItem>
-</file>
-
-<file path=customXml/itemProps4.xml><?xml version="1.0" encoding="utf-8"?>
-<ds:datastoreItem xmlns:ds="http://schemas.openxmlformats.org/officeDocument/2006/customXml" ds:itemID="{70B9C780-39DA-49AB-999D-1412EABDA6BE}">
-  <ds:schemaRefs>
-    <ds:schemaRef ds:uri="http://schemas.openxmlformats.org/officeDocument/2006/bibliography"/>
-  </ds:schemaRefs>
-</ds:datastoreItem>
 </file>
</xml_diff>